<commit_message>
Conference paper: abbreviations explained at first use; italic abstract in LaTeX
Co-Authored-By: Claude Opus 5.5 <noreply@anthropic.com>
Claude-Session: https://claude.ai/code/session_01M6nzTGf2BxoZJ1WNWqPNXm
</commit_message>
<xml_diff>
--- a/docs/article_smd/out/articol_SMD_UTM_2026.docx
+++ b/docs/article_smd/out/articol_SMD_UTM_2026.docx
@@ -211,7 +211,7 @@
         <w:t xml:space="preserve"> </w:t>
       </w:r>
       <w:r>
-        <w:t xml:space="preserve">Detectoarele clasice de deviere conceptuală urmăresc rata de eroare a modelului, deci au nevoie de etichete și reacționează abia după ce acuratețea a scăzut. Lucrarea testează dacă incertitudinea modelului, calculată numai din intrări, poate da o alarmă mai devreme și ce componentă a ei este utilă. Entropia predictivă a unei rețele MC-Dropout, a unui ansamblu de rețele și a două ansambluri frecventiste (SVM și pădure aleatoare) este separată în incertitudine aleatorică și epistemică, iar raportul lor logaritmic este propus ca semnal de monitorizare. Pe 225 de fluxuri construite din date reale, cu moment de deviere cunoscut, și pe fluxul natural Elec2, cinci ipoteze stabilite în prealabil au fost testate statistic. Raportul separă cel mai bine datele deviate pentru rețelele neuronale (AUROC 0.80 față de 0.67), dar nu și pentru modelele frecventiste. Alarma fără etichete vine mai devreme decât detectoarele bazate pe eroare, însă precede scăderea vizibilă a acurateței doar în 51 % din cazuri. Devierea relației dintre intrări și etichete rămâne invizibilă fără etichete, iar SHAP, spre deosebire de LIME, indică trăsăturile care au deviat. Codul și datele permit reproducerea integrală.</w:t>
+        <w:t xml:space="preserve">Detectoarele clasice de deviere conceptuală urmăresc rata de eroare a modelului, deci au nevoie de etichete și reacționează abia după ce acuratețea a scăzut. Lucrarea testează dacă incertitudinea modelului, calculată numai din intrări, poate da o alarmă mai devreme și ce componentă a ei este utilă. Entropia predictivă a unei rețele MC-Dropout, a unui ansamblu de rețele și a două ansambluri frecventiste (SVM și pădure aleatoare) este separată în incertitudine aleatorică și epistemică, iar raportul lor logaritmic este propus ca semnal de monitorizare. Pe 225 de fluxuri construite din date reale, cu moment de deviere cunoscut, și pe fluxul natural Elec2, cinci ipoteze stabilite în prealabil au fost testate statistic. Raportul separă cel mai bine datele deviate pentru rețelele neuronale (aria de sub curba ROC 0.80 față de 0.67), dar nu și pentru modelele frecventiste. Alarma fără etichete vine mai devreme decât detectoarele bazate pe eroare, însă precede scăderea vizibilă a acurateței doar în 51 % din cazuri. Devierea relației dintre intrări și etichete rămâne invizibilă fără etichete, iar SHAP, spre deosebire de LIME, indică trăsăturile care au deviat. Codul și datele permit reproducerea integrală.</w:t>
       </w:r>
     </w:p>
     <w:p>
@@ -375,31 +375,51 @@
         <w:t xml:space="preserve">concept drift</w:t>
       </w:r>
       <w:r>
-        <w:t xml:space="preserve">) [1,2]. Detectoarele uzuale, DDM [3], ADWIN [4] și Page-Hinkley (PH) [5], urmăresc rata de eroare. Ele au nevoie de eticheta reală a fiecărei predicții, care în creditare sau în detectarea fraudei sosește după luni, și reacționează după ce acuratețea a scăzut.</w:t>
-      </w:r>
-    </w:p>
-    <w:p>
-      <w:pPr>
-        <w:pStyle w:val="BodyText"/>
-      </w:pPr>
-      <w:r>
-        <w:t xml:space="preserve">O alternativă este incertitudinea modelului însuși. Baier et al. [6] monitorizează incertitudinea</w:t>
-      </w:r>
-      <w:r>
-        <w:t xml:space="preserve"> </w:t>
+        <w:t xml:space="preserve">) [1,2]. Detectoarele uzuale, DDM (</w:t>
       </w:r>
       <w:r>
         <w:rPr>
           <w:iCs/>
           <w:i/>
         </w:rPr>
+        <w:t xml:space="preserve">Drift Detection Method</w:t>
+      </w:r>
+      <w:r>
+        <w:t xml:space="preserve">) [3], ADWIN (</w:t>
+      </w:r>
+      <w:r>
+        <w:rPr>
+          <w:iCs/>
+          <w:i/>
+        </w:rPr>
+        <w:t xml:space="preserve">ADaptive WINdowing</w:t>
+      </w:r>
+      <w:r>
+        <w:t xml:space="preserve">) [4] și Page-Hinkley (PH) [5], urmăresc rata de eroare. Ele au nevoie de eticheta reală a fiecărei predicții, care în creditare sau în detectarea fraudei sosește după luni, și reacționează după ce acuratețea a scăzut.</w:t>
+      </w:r>
+    </w:p>
+    <w:p>
+      <w:pPr>
+        <w:pStyle w:val="BodyText"/>
+      </w:pPr>
+      <w:r>
+        <w:t xml:space="preserve">O alternativă este incertitudinea modelului însuși. Baier et al. [6] monitorizează incertitudinea</w:t>
+      </w:r>
+      <w:r>
+        <w:t xml:space="preserve"> </w:t>
+      </w:r>
+      <w:r>
+        <w:rPr>
+          <w:iCs/>
+          <w:i/>
+        </w:rPr>
         <w:t xml:space="preserve">totală</w:t>
       </w:r>
       <w:r>
         <w:t xml:space="preserve"> </w:t>
       </w:r>
       <w:r>
-        <w:t xml:space="preserve">a unei rețele MC-Dropout. Teoria bayesiană permite însă separarea incertitudinii în componenta aleatorică (AU, zgomotul din date) și cea epistemică (EU, ignoranța modelului) [7–9]. Contribuțiile lucrării sunt: (i) raportul</w:t>
+        <w:t xml:space="preserve">a unei rețele Monte Carlo Dropout (MC-Dropout). Teoria bayesiană permite însă separarea incertitudinii în componenta aleatorică (AU, zgomotul din date) și cea epistemică (EU, ignoranța modelului) [7–9]. Contribuțiile lucrării sunt: (i) raportul</w:t>
       </w:r>
       <w:r>
         <w:t xml:space="preserve"> </w:t>
@@ -444,7 +464,7 @@
         <w:t xml:space="preserve"> </w:t>
       </w:r>
       <w:r>
-        <w:t xml:space="preserve">ca semnal de monitorizare, comparat direct cu componentele sale; (ii) demonstrarea limitei oricărei detecții fără etichete; (iii) validarea alarmelor prin explicarea funcției</w:t>
+        <w:t xml:space="preserve">ca semnal de monitorizare, comparat direct cu componentele sale; (ii) demonstrarea limitei oricărei detecții fără etichete; (iii) validarea alarmelor prin metode de inteligență artificială explicabilă (XAI): explicarea funcției</w:t>
       </w:r>
       <w:r>
         <w:t xml:space="preserve"> </w:t>
@@ -474,7 +494,27 @@
         <w:t xml:space="preserve"> </w:t>
       </w:r>
       <w:r>
-        <w:t xml:space="preserve">cu SHAP și LIME; (iv) comparația dintre incertitudinea bayesiană și cea frecventistă; (v) fluxuri semi-sintetice cu moment și trăsături de deviere cunoscute.</w:t>
+        <w:t xml:space="preserve">cu SHAP (</w:t>
+      </w:r>
+      <w:r>
+        <w:rPr>
+          <w:iCs/>
+          <w:i/>
+        </w:rPr>
+        <w:t xml:space="preserve">SHapley Additive exPlanations</w:t>
+      </w:r>
+      <w:r>
+        <w:t xml:space="preserve">) și LIME (</w:t>
+      </w:r>
+      <w:r>
+        <w:rPr>
+          <w:iCs/>
+          <w:i/>
+        </w:rPr>
+        <w:t xml:space="preserve">Local Interpretable Model-agnostic Explanations</w:t>
+      </w:r>
+      <w:r>
+        <w:t xml:space="preserve">); (iv) comparația dintre incertitudinea bayesiană și cea frecventistă; (v) fluxuri semi-sintetice cu moment și trăsături de deviere cunoscute.</w:t>
       </w:r>
     </w:p>
     <w:p>
@@ -720,7 +760,30 @@
         <w:pStyle w:val="FirstParagraph"/>
       </w:pPr>
       <w:r>
-        <w:t xml:space="preserve">Antrenarea prin entropie încrucișată este o estimare de verosimilitate maximă, iar penalizarea L2 corespunde unei distribuții a priori gaussiene (estimare MAP). Distribuția a posteriori a ponderilor este aproximată prin MC-Dropout cu</w:t>
+        <w:t xml:space="preserve">Antrenarea prin entropie încrucișată este o estimare de verosimilitate maximă, iar penalizarea L2 corespunde unei distribuții a priori gaussiene (estimare</w:t>
+      </w:r>
+      <w:r>
+        <w:t xml:space="preserve"> </w:t>
+      </w:r>
+      <w:r>
+        <w:rPr>
+          <w:iCs/>
+          <w:i/>
+        </w:rPr>
+        <w:t xml:space="preserve">maximum a posteriori</w:t>
+      </w:r>
+      <w:r>
+        <w:t xml:space="preserve">, MAP). Rețelele au două straturi ascunse de 64 de neuroni cu activare ReLU (</w:t>
+      </w:r>
+      <w:r>
+        <w:rPr>
+          <w:iCs/>
+          <w:i/>
+        </w:rPr>
+        <w:t xml:space="preserve">rectified linear unit</w:t>
+      </w:r>
+      <w:r>
+        <w:t xml:space="preserve">). Distribuția a posteriori a ponderilor este aproximată prin MC-Dropout cu</w:t>
       </w:r>
       <w:r>
         <w:t xml:space="preserve"> </w:t>
@@ -766,7 +829,7 @@
         <w:t xml:space="preserve"> </w:t>
       </w:r>
       <w:r>
-        <w:t xml:space="preserve">rețele [11]. Ca termen frecventist se folosesc 10 SVM-uri cu nucleu RBF antrenate pe eșantioane bootstrap. Ca analiză suplimentară, adăugată după studiul principal, se folosește o pădure aleatoare de 50 de arbori [12], descompusă ca în [13]. Pentru</w:t>
+        <w:t xml:space="preserve">rețele [11]. Ca termen frecventist se folosesc 10 mașini cu vectori-suport (SVM) cu nucleu gaussian (RBF), antrenate pe eșantioane bootstrap. Ca analiză suplimentară, adăugată după studiul principal, se folosește o pădure aleatoare de 50 de arbori [12], descompusă ca în [13]. Pentru</w:t>
       </w:r>
       <w:r>
         <w:t xml:space="preserve"> </w:t>
@@ -2136,7 +2199,23 @@
         <w:pStyle w:val="FirstParagraph"/>
       </w:pPr>
       <w:r>
-        <w:t xml:space="preserve">Semnalele fără etichete sunt monitorizate cu PH, ADWIN, o detecție bayesiană online a punctelor de schimbare (BOCPD) [19] și un amestec gaussian estimat prin EM [20], ultimele două implementate de autor, alături de testul Kolmogorov-Smirnov pe intrări [21]. Pragurile sunt calibrate astfel încât probabilitatea unei alarme false pe un flux staționar să fie cel mult 0.10. Scăderea vizibilă a acurateței este primul moment în care acuratețea pe ultimele 300 de înregistrări scade cu peste trei erori standard sub nivelul inițial. Atribuirile sunt calculate cu KernelSHAP [22], GradientSHAP și LIME [23].</w:t>
+        <w:t xml:space="preserve">Semnalele fără etichete sunt monitorizate cu PH, ADWIN, o detecție bayesiană online a punctelor de schimbare (BOCPD) [19] și un amestec gaussian estimat prin algoritmul</w:t>
+      </w:r>
+      <w:r>
+        <w:t xml:space="preserve"> </w:t>
+      </w:r>
+      <w:r>
+        <w:rPr>
+          <w:iCs/>
+          <w:i/>
+        </w:rPr>
+        <w:t xml:space="preserve">Expectation-Maximization</w:t>
+      </w:r>
+      <w:r>
+        <w:t xml:space="preserve"> </w:t>
+      </w:r>
+      <w:r>
+        <w:t xml:space="preserve">(EM) [20], ultimele două implementate de autor, alături de testul Kolmogorov-Smirnov pe intrări [21]. Pragurile sunt calibrate astfel încât probabilitatea unei alarme false pe un flux staționar să fie cel mult 0.10. Scăderea vizibilă a acurateței este primul moment în care acuratețea pe ultimele 300 de înregistrări scade cu peste trei erori standard sub nivelul inițial. Separabilitatea unui semnal este măsurată prin aria de sub curba ROC (AUROC; 0.5 înseamnă nicio informație). Atribuirile sunt calculate cu KernelSHAP [22], GradientSHAP și LIME [23].</w:t>
       </w:r>
     </w:p>
     <w:p>
@@ -2144,7 +2223,17 @@
         <w:pStyle w:val="BodyText"/>
       </w:pPr>
       <w:r>
-        <w:t xml:space="preserve">Înregistrările dintr-un flux nu sunt independente, de aceea unitatea de analiză este rularea. Au fost efectuate 225 de rulări (12 scenarii × 3 modele × 5 semințe, plus 45 de ablații), testate cu Wilcoxon și corecție Holm [24], echivalența cu hazardul prin TOST [25], fluxul Elec2 prin bootstrap pe blocuri [26], iar rezultatele pe seturi de date au fost agregate prin meta-analiză cu efecte aleatoare [27]. Toți parametrii se află într-un singur fișier de configurare, o rulare completă durează aproximativ o oră pe un calculator cu două nuclee, iar rezultatele au fost reproduse identic pe o copie nouă a depozitului.</w:t>
+        <w:t xml:space="preserve">Înregistrările dintr-un flux nu sunt independente, de aceea unitatea de analiză este rularea. Au fost efectuate 225 de rulări (12 scenarii × 3 modele × 5 semințe, plus 45 de ablații), testate cu Wilcoxon și corecție Holm [24], echivalența cu hazardul prin testul TOST (</w:t>
+      </w:r>
+      <w:r>
+        <w:rPr>
+          <w:iCs/>
+          <w:i/>
+        </w:rPr>
+        <w:t xml:space="preserve">two one-sided tests</w:t>
+      </w:r>
+      <w:r>
+        <w:t xml:space="preserve">) [25], fluxul Elec2 prin bootstrap pe blocuri [26], iar rezultatele pe seturi de date au fost agregate prin meta-analiză cu efecte aleatoare [27]. Toți parametrii se află într-un singur fișier de configurare, iar rezultatele au fost reproduse identic pe o copie nouă a depozitului.</w:t>
       </w:r>
     </w:p>
     <w:bookmarkEnd w:id="23"/>
@@ -3280,7 +3369,7 @@
         </m:r>
       </m:oMath>
       <w:r>
-        <w:t xml:space="preserve">), dar precede scăderea vizibilă doar în 51 % din cele 53 de rulări relevante (avans median 30, IC 95 % [−25; 151],</w:t>
+        <w:t xml:space="preserve">), dar precede scăderea vizibilă doar în 51 % din cele 53 de rulări relevante (avans median 30, interval de încredere 95 % [−25; 151],</w:t>
       </w:r>
       <w:r>
         <w:t xml:space="preserve"> </w:t>
@@ -3335,7 +3424,7 @@
         </m:r>
       </m:oMath>
       <w:r>
-        <w:t xml:space="preserve">), fără a o anticipa. Fig. 4 rezumă compromisul dintre avertizarea timpurie și alarmele false pentru toți detectorii: detectoarele bazate pe eroare aproape niciodată nu avertizează înaintea scăderii vizibile, deoarece urmăresc chiar eroarea.</w:t>
+        <w:t xml:space="preserve">), fără a o anticipa. Fig. 4 arată că detectoarele bazate pe eroare aproape niciodată nu avertizează înaintea scăderii vizibile, deoarece urmăresc chiar eroarea.</w:t>
       </w:r>
     </w:p>
     <w:p>

</xml_diff>

<commit_message>
Conference paper without the declaration page (optional via --declaration)
Co-Authored-By: Claude Opus 5.5 <noreply@anthropic.com>
Claude-Session: https://claude.ai/code/session_01M6nzTGf2BxoZJ1WNWqPNXm
</commit_message>
<xml_diff>
--- a/docs/article_smd/out/articol_SMD_UTM_2026.docx
+++ b/docs/article_smd/out/articol_SMD_UTM_2026.docx
@@ -4661,123 +4661,6 @@
       </w:r>
       <w:r>
         <w:t xml:space="preserve">, Pittsburgh, USA, 31 July – 4 August 2023; Proceedings of Machine Learning Research, vol. 216; PMLR, 2023; pp. 2282–2292.</w:t>
-      </w:r>
-    </w:p>
-    <w:p>
-      <w:r>
-        <w:br w:type="page"/>
-      </w:r>
-    </w:p>
-    <w:p>
-      <w:pPr>
-        <w:spacing w:line="276" w:lineRule="auto"/>
-        <w:jc w:val="both"/>
-      </w:pPr>
-    </w:p>
-    <w:p>
-      <w:pPr>
-        <w:spacing w:line="276" w:lineRule="auto"/>
-        <w:jc w:val="both"/>
-      </w:pPr>
-    </w:p>
-    <w:p>
-      <w:pPr>
-        <w:spacing w:line="276" w:lineRule="auto"/>
-        <w:jc w:val="center"/>
-      </w:pPr>
-      <w:r>
-        <w:rPr>
-          <w:b/>
-          <w:bCs/>
-          <w:color w:val="222222"/>
-          <w:lang w:val="ro-RO" w:eastAsia="en-US"/>
-        </w:rPr>
-        <w:t>Declarație de originalitate și asumare a responsabilității</w:t>
-      </w:r>
-    </w:p>
-    <w:p>
-      <w:pPr>
-        <w:spacing w:line="276" w:lineRule="auto"/>
-        <w:jc w:val="both"/>
-      </w:pPr>
-    </w:p>
-    <w:p>
-      <w:pPr>
-        <w:spacing w:line="360" w:lineRule="auto"/>
-        <w:jc w:val="both"/>
-      </w:pPr>
-      <w:r>
-        <w:rPr>
-          <w:color w:val="222222"/>
-          <w:lang w:val="ro-RO" w:eastAsia="en-US"/>
-        </w:rPr>
-        <w:t xml:space="preserve">Subsemnatul(a), în calitate de autor corespondent, declar că lucrarea cu titlul „Descompunerea bayesiană a incertitudinii pentru avertizarea timpurie a devierii conceptuale, validată prin XAI” este originală, reprezintă rezultatul activității autorilor și că toate sursele bibliografice utilizate sunt citate corespunzător. Îmi asum responsabilitatea pentru integritatea lucrării și corectitudinea informațiilor prezentate în această lucrare în numele tuturor coautorilor.</w:t>
-      </w:r>
-    </w:p>
-    <w:p>
-      <w:pPr>
-        <w:spacing w:line="276" w:lineRule="auto"/>
-        <w:jc w:val="both"/>
-      </w:pPr>
-    </w:p>
-    <w:p>
-      <w:pPr>
-        <w:spacing w:line="276" w:lineRule="auto"/>
-        <w:jc w:val="both"/>
-      </w:pPr>
-    </w:p>
-    <w:p>
-      <w:pPr>
-        <w:spacing w:line="276" w:lineRule="auto"/>
-        <w:ind w:left="567" w:hanging="567"/>
-        <w:jc w:val="both"/>
-      </w:pPr>
-      <w:r>
-        <w:rPr>
-          <w:color w:val="222222"/>
-          <w:lang w:val="ro-RO" w:eastAsia="en-US"/>
-        </w:rPr>
-        <w:t xml:space="preserve">Numele și prenumele: ______________________</w:t>
-      </w:r>
-    </w:p>
-    <w:p>
-      <w:pPr>
-        <w:spacing w:line="276" w:lineRule="auto"/>
-        <w:jc w:val="both"/>
-      </w:pPr>
-    </w:p>
-    <w:p>
-      <w:pPr>
-        <w:spacing w:line="276" w:lineRule="auto"/>
-        <w:ind w:left="567" w:hanging="567"/>
-        <w:jc w:val="both"/>
-      </w:pPr>
-      <w:r>
-        <w:rPr>
-          <w:color w:val="222222"/>
-          <w:lang w:val="ro-RO" w:eastAsia="en-US"/>
-        </w:rPr>
-        <w:t xml:space="preserve">Semnătura: ______________________</w:t>
-      </w:r>
-    </w:p>
-    <w:p>
-      <w:pPr>
-        <w:spacing w:line="276" w:lineRule="auto"/>
-        <w:jc w:val="both"/>
-      </w:pPr>
-    </w:p>
-    <w:p>
-      <w:pPr>
-        <w:spacing w:line="276" w:lineRule="auto"/>
-        <w:ind w:left="567" w:hanging="567"/>
-        <w:jc w:val="both"/>
-      </w:pPr>
-      <w:r>
-        <w:rPr>
-          <w:color w:val="222222"/>
-          <w:lang w:val="ro-RO" w:eastAsia="en-US"/>
-        </w:rPr>
-        <w:t xml:space="preserve">Data: ______________________</w:t>
       </w:r>
     </w:p>
     <w:bookmarkEnd w:id="42"/>

</xml_diff>